<commit_message>
finalize compendium v3: clean submission scope, update A.2 file list
</commit_message>
<xml_diff>
--- a/COMPENDIUM_v3.docx
+++ b/COMPENDIUM_v3.docx
@@ -7215,6 +7215,42 @@
         <w:rPr>
           <w:rStyle w:val="VerbatimChar"/>
         </w:rPr>
+        <w:t xml:space="preserve">COMPENDIUM_v3.md</w:t>
+      </w:r>
+      <w:r>
+        <w:t xml:space="preserve"> </w:t>
+      </w:r>
+      <w:r>
+        <w:t xml:space="preserve">/</w:t>
+      </w:r>
+      <w:r>
+        <w:t xml:space="preserve"> </w:t>
+      </w:r>
+      <w:r>
+        <w:rPr>
+          <w:rStyle w:val="VerbatimChar"/>
+        </w:rPr>
+        <w:t xml:space="preserve">COMPENDIUM_v3.docx</w:t>
+      </w:r>
+      <w:r>
+        <w:t xml:space="preserve"> </w:t>
+      </w:r>
+      <w:r>
+        <w:t xml:space="preserve">— this compendium (source markdown + Word export).</w:t>
+      </w:r>
+    </w:p>
+    <w:p>
+      <w:pPr>
+        <w:pStyle w:val="Compact"/>
+        <w:numPr>
+          <w:ilvl w:val="0"/>
+          <w:numId w:val="1016"/>
+        </w:numPr>
+      </w:pPr>
+      <w:r>
+        <w:rPr>
+          <w:rStyle w:val="VerbatimChar"/>
+        </w:rPr>
         <w:t xml:space="preserve">sprint01/</w:t>
       </w:r>
       <w:r>
@@ -7239,46 +7275,10 @@
         <w:t xml:space="preserve">signals.md</w:t>
       </w:r>
       <w:r>
-        <w:t xml:space="preserve">,</w:t>
-      </w:r>
-      <w:r>
-        <w:t xml:space="preserve"> </w:t>
-      </w:r>
-      <w:r>
-        <w:rPr>
-          <w:rStyle w:val="VerbatimChar"/>
-        </w:rPr>
-        <w:t xml:space="preserve">steep.md</w:t>
-      </w:r>
-      <w:r>
-        <w:t xml:space="preserve"> </w:t>
-      </w:r>
-      <w:r>
-        <w:t xml:space="preserve">(replaces previous draft),</w:t>
-      </w:r>
-      <w:r>
-        <w:t xml:space="preserve"> </w:t>
-      </w:r>
-      <w:r>
-        <w:rPr>
-          <w:rStyle w:val="VerbatimChar"/>
-        </w:rPr>
-        <w:t xml:space="preserve">bibliography.md</w:t>
-      </w:r>
-      <w:r>
-        <w:t xml:space="preserve"> </w:t>
-      </w:r>
-      <w:r>
-        <w:t xml:space="preserve">(Chicago NB, 11 entries),</w:t>
-      </w:r>
-      <w:r>
-        <w:t xml:space="preserve"> </w:t>
-      </w:r>
-      <w:r>
-        <w:rPr>
-          <w:rStyle w:val="VerbatimChar"/>
-        </w:rPr>
-        <w:t xml:space="preserve">personal_notes.md</w:t>
+        <w:t xml:space="preserve"> </w:t>
+      </w:r>
+      <w:r>
+        <w:t xml:space="preserve">— 16 signals across 5 data sources</w:t>
       </w:r>
     </w:p>
     <w:p>
@@ -7293,13 +7293,13 @@
         <w:rPr>
           <w:rStyle w:val="VerbatimChar"/>
         </w:rPr>
-        <w:t xml:space="preserve">raw_capture/</w:t>
-      </w:r>
-      <w:r>
-        <w:t xml:space="preserve"> </w:t>
-      </w:r>
-      <w:r>
-        <w:t xml:space="preserve">— original PDFs, CSVs, screenshots from all required databases.</w:t>
+        <w:t xml:space="preserve">steep.md</w:t>
+      </w:r>
+      <w:r>
+        <w:t xml:space="preserve"> </w:t>
+      </w:r>
+      <w:r>
+        <w:t xml:space="preserve">— STEEP analysis, 5 dimensions (final version)</w:t>
       </w:r>
     </w:p>
     <w:p>
@@ -7314,13 +7314,76 @@
         <w:rPr>
           <w:rStyle w:val="VerbatimChar"/>
         </w:rPr>
-        <w:t xml:space="preserve">photos/</w:t>
-      </w:r>
-      <w:r>
-        <w:t xml:space="preserve"> </w:t>
-      </w:r>
-      <w:r>
-        <w:t xml:space="preserve">— Statista capture screenshots.</w:t>
+        <w:t xml:space="preserve">bibliography.md</w:t>
+      </w:r>
+      <w:r>
+        <w:t xml:space="preserve"> </w:t>
+      </w:r>
+      <w:r>
+        <w:t xml:space="preserve">— Chicago Notes-Bibliography, 11 entries</w:t>
+      </w:r>
+    </w:p>
+    <w:p>
+      <w:pPr>
+        <w:pStyle w:val="Compact"/>
+        <w:numPr>
+          <w:ilvl w:val="1"/>
+          <w:numId w:val="1017"/>
+        </w:numPr>
+      </w:pPr>
+      <w:r>
+        <w:rPr>
+          <w:rStyle w:val="VerbatimChar"/>
+        </w:rPr>
+        <w:t xml:space="preserve">personal_notes.md</w:t>
+      </w:r>
+      <w:r>
+        <w:t xml:space="preserve"> </w:t>
+      </w:r>
+      <w:r>
+        <w:t xml:space="preserve">— working research notes</w:t>
+      </w:r>
+    </w:p>
+    <w:p>
+      <w:pPr>
+        <w:pStyle w:val="Compact"/>
+        <w:numPr>
+          <w:ilvl w:val="1"/>
+          <w:numId w:val="1017"/>
+        </w:numPr>
+      </w:pPr>
+      <w:r>
+        <w:rPr>
+          <w:rStyle w:val="VerbatimChar"/>
+        </w:rPr>
+        <w:t xml:space="preserve">raw_capture/</w:t>
+      </w:r>
+      <w:r>
+        <w:t xml:space="preserve"> </w:t>
+      </w:r>
+      <w:r>
+        <w:t xml:space="preserve">— original source files: EU AI Act PDF, UN WPP CSV + summary, UN WUP report, IPCC AR6 SPM, Statista exports</w:t>
+      </w:r>
+    </w:p>
+    <w:p>
+      <w:pPr>
+        <w:pStyle w:val="Compact"/>
+        <w:numPr>
+          <w:ilvl w:val="1"/>
+          <w:numId w:val="1017"/>
+        </w:numPr>
+      </w:pPr>
+      <w:r>
+        <w:rPr>
+          <w:rStyle w:val="VerbatimChar"/>
+        </w:rPr>
+        <w:t xml:space="preserve">photos/statista_2026-04-28/</w:t>
+      </w:r>
+      <w:r>
+        <w:t xml:space="preserve"> </w:t>
+      </w:r>
+      <w:r>
+        <w:t xml:space="preserve">— Statista capture screenshots</w:t>
       </w:r>
     </w:p>
     <w:p>
@@ -7359,82 +7422,109 @@
         <w:t xml:space="preserve">Cone_of_Plausibility.md</w:t>
       </w:r>
       <w:r>
-        <w:t xml:space="preserve">,</w:t>
-      </w:r>
-      <w:r>
-        <w:t xml:space="preserve"> </w:t>
-      </w:r>
-      <w:r>
-        <w:rPr>
-          <w:rStyle w:val="VerbatimChar"/>
-        </w:rPr>
-        <w:t xml:space="preserve">futures_wheel_output.md</w:t>
-      </w:r>
-      <w:r>
-        <w:t xml:space="preserve">,</w:t>
-      </w:r>
-      <w:r>
-        <w:t xml:space="preserve"> </w:t>
-      </w:r>
-      <w:r>
-        <w:rPr>
-          <w:rStyle w:val="VerbatimChar"/>
-        </w:rPr>
-        <w:t xml:space="preserve">rapid_forecasting.md</w:t>
-      </w:r>
-      <w:r>
-        <w:t xml:space="preserve">,</w:t>
-      </w:r>
-      <w:r>
-        <w:t xml:space="preserve"> </w:t>
-      </w:r>
-      <w:r>
-        <w:rPr>
-          <w:rStyle w:val="VerbatimChar"/>
-        </w:rPr>
-        <w:t xml:space="preserve">backcasting.md</w:t>
+        <w:t xml:space="preserve"> </w:t>
+      </w:r>
+      <w:r>
+        <w:t xml:space="preserve">— three 2046 cones (Tiered / Care Commons / Two-Tier)</w:t>
       </w:r>
     </w:p>
     <w:p>
       <w:pPr>
         <w:pStyle w:val="Compact"/>
         <w:numPr>
-          <w:ilvl w:val="0"/>
-          <w:numId w:val="1016"/>
+          <w:ilvl w:val="1"/>
+          <w:numId w:val="1018"/>
         </w:numPr>
       </w:pPr>
       <w:r>
         <w:rPr>
           <w:rStyle w:val="VerbatimChar"/>
         </w:rPr>
-        <w:t xml:space="preserve">connection_club_site/</w:t>
-      </w:r>
-      <w:r>
-        <w:t xml:space="preserve"> </w:t>
-      </w:r>
-      <w:r>
-        <w:t xml:space="preserve">— the artifact (React + Vite + Tailwind website).</w:t>
+        <w:t xml:space="preserve">futures_wheel_output.md</w:t>
+      </w:r>
+      <w:r>
+        <w:t xml:space="preserve"> </w:t>
+      </w:r>
+      <w:r>
+        <w:t xml:space="preserve">— wheel narrative + Figma spec</w:t>
       </w:r>
     </w:p>
     <w:p>
       <w:pPr>
         <w:pStyle w:val="Compact"/>
         <w:numPr>
-          <w:ilvl w:val="0"/>
-          <w:numId w:val="1016"/>
+          <w:ilvl w:val="1"/>
+          <w:numId w:val="1018"/>
         </w:numPr>
       </w:pPr>
       <w:r>
         <w:rPr>
           <w:rStyle w:val="VerbatimChar"/>
         </w:rPr>
-        <w:t xml:space="preserve">presentation_script.md</w:t>
-      </w:r>
-      <w:r>
-        <w:t xml:space="preserve"> </w:t>
-      </w:r>
-      <w:r>
-        <w:t xml:space="preserve">— final presentation script with timing.</w:t>
+        <w:t xml:space="preserve">dating_2046_futures_wheel_v7.png</w:t>
+      </w:r>
+      <w:r>
+        <w:t xml:space="preserve"> </w:t>
+      </w:r>
+      <w:r>
+        <w:t xml:space="preserve">/</w:t>
+      </w:r>
+      <w:r>
+        <w:t xml:space="preserve"> </w:t>
+      </w:r>
+      <w:r>
+        <w:rPr>
+          <w:rStyle w:val="VerbatimChar"/>
+        </w:rPr>
+        <w:t xml:space="preserve">.svg</w:t>
+      </w:r>
+      <w:r>
+        <w:t xml:space="preserve"> </w:t>
+      </w:r>
+      <w:r>
+        <w:t xml:space="preserve">— wheel diagram (figure in §2.1)</w:t>
+      </w:r>
+    </w:p>
+    <w:p>
+      <w:pPr>
+        <w:pStyle w:val="Compact"/>
+        <w:numPr>
+          <w:ilvl w:val="1"/>
+          <w:numId w:val="1018"/>
+        </w:numPr>
+      </w:pPr>
+      <w:r>
+        <w:rPr>
+          <w:rStyle w:val="VerbatimChar"/>
+        </w:rPr>
+        <w:t xml:space="preserve">rapid_forecasting.md</w:t>
+      </w:r>
+      <w:r>
+        <w:t xml:space="preserve"> </w:t>
+      </w:r>
+      <w:r>
+        <w:t xml:space="preserve">— climate + demographic forecasting</w:t>
+      </w:r>
+    </w:p>
+    <w:p>
+      <w:pPr>
+        <w:pStyle w:val="Compact"/>
+        <w:numPr>
+          <w:ilvl w:val="1"/>
+          <w:numId w:val="1018"/>
+        </w:numPr>
+      </w:pPr>
+      <w:r>
+        <w:rPr>
+          <w:rStyle w:val="VerbatimChar"/>
+        </w:rPr>
+        <w:t xml:space="preserve">backcasting.md</w:t>
+      </w:r>
+      <w:r>
+        <w:t xml:space="preserve"> </w:t>
+      </w:r>
+      <w:r>
+        <w:t xml:space="preserve">— Care Commons backcast</w:t>
       </w:r>
     </w:p>
     <w:p>

</xml_diff>